<commit_message>
fix(docx): dynamically inject loop tags and fix trailing pct symbol in image rendering
</commit_message>
<xml_diff>
--- a/public/templates/recruit_training_template.docx
+++ b/public/templates/recruit_training_template.docx
@@ -2757,7 +2757,7 @@
                 <w:b/>
                 <w:sz w:val="24"/>
               </w:rPr>
-              <w:t>소속</w:t>
+              <w:t>직군1</w:t>
             </w:r>
           </w:p>
         </w:tc>
@@ -2897,7 +2897,7 @@
                 <w:b/>
                 <w:sz w:val="24"/>
               </w:rPr>
-              <w:t>소속</w:t>
+              <w:t>직군2</w:t>
             </w:r>
           </w:p>
         </w:tc>
@@ -3054,7 +3054,7 @@
                 <w:sz w:val="18"/>
                 <w:szCs w:val="18"/>
               </w:rPr>
-              <w:t>직군</w:t>
+              <w:t>직군3</w:t>
             </w:r>
             <w:r>
               <w:rPr>
@@ -3109,7 +3109,7 @@
                 <w:sz w:val="18"/>
                 <w:szCs w:val="18"/>
               </w:rPr>
-              <w:t>이름</w:t>
+              <w:t>이름1</w:t>
             </w:r>
             <w:r>
               <w:rPr>

</xml_diff>